<commit_message>
Increase color contrast in Ora_APPy flow doc
Co-Authored-By: Claude Opus 5.5 <noreply@anthropic.com>
Claude-Session: https://claude.ai/code/session_01BY7SQSjjfApeSFFCc9xbr8
</commit_message>
<xml_diff>
--- a/Ora_APPy请求链路.docx
+++ b/Ora_APPy请求链路.docx
@@ -16,21 +16,21 @@
       </w:pPr>
       <w:r>
         <w:rPr>
-          <w:color w:val="5B6A71"/>
+          <w:color w:val="1A1A1A"/>
         </w:rPr>
         <w:t xml:space="preserve">从浏览器打开 </w:t>
       </w:r>
       <w:r>
         <w:rPr>
           <w:rFonts w:ascii="Consolas" w:cs="Consolas" w:eastAsia="Microsoft YaHei" w:hAnsi="Consolas"/>
-          <w:color w:val="5B6A71"/>
-          <w:shd w:fill="E2EFF4" w:color="auto" w:val="clear"/>
+          <w:color w:val="000000"/>
+          <w:shd w:fill="EDEDED" w:color="auto" w:val="clear"/>
         </w:rPr>
         <w:t xml:space="preserve">tn1mfg-ws-01.battery.mfg:83</w:t>
       </w:r>
       <w:r>
         <w:rPr>
-          <w:color w:val="5B6A71"/>
+          <w:color w:val="1A1A1A"/>
         </w:rPr>
         <w:t xml:space="preserve">，到数据从 Oracle 回到页面，中间经过的每一层，以及 2026-10-09 那次 502 是在哪一层断掉的。</w:t>
       </w:r>
@@ -95,11 +95,9 @@
       </w:pPr>
       <w:r>
         <w:rPr>
-          <w:i/>
-          <w:iCs/>
-          <w:color w:val="5B6A71"/>
-          <w:sz w:val="20"/>
-          <w:szCs w:val="20"/>
+          <w:color w:val="1A1A1A"/>
+          <w:sz w:val="21"/>
+          <w:szCs w:val="21"/>
         </w:rPr>
         <w:t xml:space="preserve">IIS 自己不处理业务，它只是“门卫 + 转接员”：在 83 端口接电话，然后转给本机 8001 端口上的 Python 程序。真正查数据的是 Python，Python 再去问 Oracle。</w:t>
       </w:r>
@@ -126,7 +124,8 @@
       <w:r>
         <w:rPr>
           <w:rFonts w:ascii="Consolas" w:cs="Consolas" w:eastAsia="Microsoft YaHei" w:hAnsi="Consolas"/>
-          <w:shd w:fill="E2EFF4" w:color="auto" w:val="clear"/>
+          <w:color w:val="000000"/>
+          <w:shd w:fill="EDEDED" w:color="auto" w:val="clear"/>
         </w:rPr>
         <w:t xml:space="preserve">:83</w:t>
       </w:r>
@@ -136,7 +135,8 @@
       <w:r>
         <w:rPr>
           <w:rFonts w:ascii="Consolas" w:cs="Consolas" w:eastAsia="Microsoft YaHei" w:hAnsi="Consolas"/>
-          <w:shd w:fill="E2EFF4" w:color="auto" w:val="clear"/>
+          <w:color w:val="000000"/>
+          <w:shd w:fill="EDEDED" w:color="auto" w:val="clear"/>
         </w:rPr>
         <w:t xml:space="preserve">C:\Intranet\Ora_APPy</w:t>
       </w:r>
@@ -166,7 +166,8 @@
       <w:r>
         <w:rPr>
           <w:rFonts w:ascii="Consolas" w:cs="Consolas" w:eastAsia="Microsoft YaHei" w:hAnsi="Consolas"/>
-          <w:shd w:fill="E2EFF4" w:color="auto" w:val="clear"/>
+          <w:color w:val="000000"/>
+          <w:shd w:fill="EDEDED" w:color="auto" w:val="clear"/>
         </w:rPr>
         <w:t xml:space="preserve">(.*)</w:t>
       </w:r>
@@ -176,7 +177,8 @@
       <w:r>
         <w:rPr>
           <w:rFonts w:ascii="Consolas" w:cs="Consolas" w:eastAsia="Microsoft YaHei" w:hAnsi="Consolas"/>
-          <w:shd w:fill="E2EFF4" w:color="auto" w:val="clear"/>
+          <w:color w:val="000000"/>
+          <w:shd w:fill="EDEDED" w:color="auto" w:val="clear"/>
         </w:rPr>
         <w:t xml:space="preserve">http://127.0.0.1:8001/</w:t>
       </w:r>
@@ -206,7 +208,8 @@
       <w:r>
         <w:rPr>
           <w:rFonts w:ascii="Consolas" w:cs="Consolas" w:eastAsia="Microsoft YaHei" w:hAnsi="Consolas"/>
-          <w:shd w:fill="E2EFF4" w:color="auto" w:val="clear"/>
+          <w:color w:val="000000"/>
+          <w:shd w:fill="EDEDED" w:color="auto" w:val="clear"/>
         </w:rPr>
         <w:t xml:space="preserve">app/api/v1/query.py</w:t>
       </w:r>
@@ -237,9 +240,9 @@
     <w:p>
       <w:pPr>
         <w:pBdr>
-          <w:left w:val="single" w:color="1F6F8B" w:sz="24" w:space="8"/>
+          <w:left w:val="single" w:color="0B4A8F" w:sz="24" w:space="8"/>
         </w:pBdr>
-        <w:shd w:fill="E2EFF4" w:color="auto" w:val="clear"/>
+        <w:shd w:fill="EEF4FC" w:color="auto" w:val="clear"/>
         <w:spacing w:after="160" w:before="120"/>
         <w:ind w:left="160"/>
       </w:pPr>
@@ -256,7 +259,8 @@
       <w:r>
         <w:rPr>
           <w:rFonts w:ascii="Consolas" w:cs="Consolas" w:eastAsia="Microsoft YaHei" w:hAnsi="Consolas"/>
-          <w:shd w:fill="E2EFF4" w:color="auto" w:val="clear"/>
+          <w:color w:val="000000"/>
+          <w:shd w:fill="EDEDED" w:color="auto" w:val="clear"/>
         </w:rPr>
         <w:t xml:space="preserve">Ora_APPy</w:t>
       </w:r>
@@ -266,7 +270,8 @@
       <w:r>
         <w:rPr>
           <w:rFonts w:ascii="Consolas" w:cs="Consolas" w:eastAsia="Microsoft YaHei" w:hAnsi="Consolas"/>
-          <w:shd w:fill="E2EFF4" w:color="auto" w:val="clear"/>
+          <w:color w:val="000000"/>
+          <w:shd w:fill="EDEDED" w:color="auto" w:val="clear"/>
         </w:rPr>
         <w:t xml:space="preserve">venv</w:t>
       </w:r>
@@ -276,7 +281,8 @@
       <w:r>
         <w:rPr>
           <w:rFonts w:ascii="Consolas" w:cs="Consolas" w:eastAsia="Microsoft YaHei" w:hAnsi="Consolas"/>
-          <w:shd w:fill="E2EFF4" w:color="auto" w:val="clear"/>
+          <w:color w:val="000000"/>
+          <w:shd w:fill="EDEDED" w:color="auto" w:val="clear"/>
         </w:rPr>
         <w:t xml:space="preserve">scripts\run_dev.ps1</w:t>
       </w:r>
@@ -344,11 +350,9 @@
       </w:pPr>
       <w:r>
         <w:rPr>
-          <w:i/>
-          <w:iCs/>
-          <w:color w:val="5B6A71"/>
-          <w:sz w:val="20"/>
-          <w:szCs w:val="20"/>
+          <w:color w:val="1A1A1A"/>
+          <w:sz w:val="21"/>
+          <w:szCs w:val="21"/>
         </w:rPr>
         <w:t xml:space="preserve">断点在第 3 步。服务的进程还在，所以 Windows 认为服务是 Running，不会自动重启；但进程已经不接受新连接了。</w:t>
       </w:r>
@@ -375,7 +379,8 @@
       <w:r>
         <w:rPr>
           <w:rFonts w:ascii="Consolas" w:cs="Consolas" w:eastAsia="Microsoft YaHei" w:hAnsi="Consolas"/>
-          <w:shd w:fill="E2EFF4" w:color="auto" w:val="clear"/>
+          <w:color w:val="000000"/>
+          <w:shd w:fill="EDEDED" w:color="auto" w:val="clear"/>
         </w:rPr>
         <w:t xml:space="preserve">bat_wip_cell_his_para_recent</w:t>
       </w:r>
@@ -405,7 +410,8 @@
       <w:r>
         <w:rPr>
           <w:rFonts w:ascii="Consolas" w:cs="Consolas" w:eastAsia="Microsoft YaHei" w:hAnsi="Consolas"/>
-          <w:shd w:fill="E2EFF4" w:color="auto" w:val="clear"/>
+          <w:color w:val="000000"/>
+          <w:shd w:fill="EDEDED" w:color="auto" w:val="clear"/>
         </w:rPr>
         <w:t xml:space="preserve">MemoryError</w:t>
       </w:r>
@@ -435,7 +441,8 @@
       <w:r>
         <w:rPr>
           <w:rFonts w:ascii="Consolas" w:cs="Consolas" w:eastAsia="Microsoft YaHei" w:hAnsi="Consolas"/>
-          <w:shd w:fill="E2EFF4" w:color="auto" w:val="clear"/>
+          <w:color w:val="000000"/>
+          <w:shd w:fill="EDEDED" w:color="auto" w:val="clear"/>
         </w:rPr>
         <w:t xml:space="preserve">WinError 64</w:t>
       </w:r>
@@ -466,9 +473,9 @@
     <w:p>
       <w:pPr>
         <w:pBdr>
-          <w:left w:val="single" w:color="B8322A" w:sz="24" w:space="8"/>
+          <w:left w:val="single" w:color="B00000" w:sz="24" w:space="8"/>
         </w:pBdr>
-        <w:shd w:fill="FBE9E7" w:color="auto" w:val="clear"/>
+        <w:shd w:fill="FFF1EF" w:color="auto" w:val="clear"/>
         <w:spacing w:after="160" w:before="120"/>
         <w:ind w:left="160"/>
       </w:pPr>
@@ -518,12 +525,12 @@
           <w:tcPr>
             <w:tcW w:type="dxa" w:w="2500"/>
             <w:tcBorders>
-              <w:top w:val="single" w:color="C9D3D7" w:sz="4"/>
-              <w:left w:val="single" w:color="C9D3D7" w:sz="4"/>
-              <w:bottom w:val="single" w:color="C9D3D7" w:sz="4"/>
-              <w:right w:val="single" w:color="C9D3D7" w:sz="4"/>
-            </w:tcBorders>
-            <w:shd w:fill="E2EFF4" w:color="auto" w:val="clear"/>
+              <w:top w:val="single" w:color="7F8C93" w:sz="4"/>
+              <w:left w:val="single" w:color="7F8C93" w:sz="4"/>
+              <w:bottom w:val="single" w:color="7F8C93" w:sz="4"/>
+              <w:right w:val="single" w:color="7F8C93" w:sz="4"/>
+            </w:tcBorders>
+            <w:shd w:fill="0B4A8F" w:color="auto" w:val="clear"/>
             <w:tcMar>
               <w:top w:type="dxa" w:w="80"/>
               <w:left w:type="dxa" w:w="120"/>
@@ -536,7 +543,7 @@
               <w:rPr>
                 <w:b/>
                 <w:bCs/>
-                <w:color w:val="1F6F8B"/>
+                <w:color w:val="FFFFFF"/>
               </w:rPr>
               <w:t xml:space="preserve">你看到的现象</w:t>
             </w:r>
@@ -546,12 +553,12 @@
           <w:tcPr>
             <w:tcW w:type="dxa" w:w="2000"/>
             <w:tcBorders>
-              <w:top w:val="single" w:color="C9D3D7" w:sz="4"/>
-              <w:left w:val="single" w:color="C9D3D7" w:sz="4"/>
-              <w:bottom w:val="single" w:color="C9D3D7" w:sz="4"/>
-              <w:right w:val="single" w:color="C9D3D7" w:sz="4"/>
-            </w:tcBorders>
-            <w:shd w:fill="E2EFF4" w:color="auto" w:val="clear"/>
+              <w:top w:val="single" w:color="7F8C93" w:sz="4"/>
+              <w:left w:val="single" w:color="7F8C93" w:sz="4"/>
+              <w:bottom w:val="single" w:color="7F8C93" w:sz="4"/>
+              <w:right w:val="single" w:color="7F8C93" w:sz="4"/>
+            </w:tcBorders>
+            <w:shd w:fill="0B4A8F" w:color="auto" w:val="clear"/>
             <w:tcMar>
               <w:top w:type="dxa" w:w="80"/>
               <w:left w:type="dxa" w:w="120"/>
@@ -564,7 +571,7 @@
               <w:rPr>
                 <w:b/>
                 <w:bCs/>
-                <w:color w:val="1F6F8B"/>
+                <w:color w:val="FFFFFF"/>
               </w:rPr>
               <w:t xml:space="preserve">出问题的层</w:t>
             </w:r>
@@ -574,12 +581,12 @@
           <w:tcPr>
             <w:tcW w:type="dxa" w:w="4460"/>
             <w:tcBorders>
-              <w:top w:val="single" w:color="C9D3D7" w:sz="4"/>
-              <w:left w:val="single" w:color="C9D3D7" w:sz="4"/>
-              <w:bottom w:val="single" w:color="C9D3D7" w:sz="4"/>
-              <w:right w:val="single" w:color="C9D3D7" w:sz="4"/>
-            </w:tcBorders>
-            <w:shd w:fill="E2EFF4" w:color="auto" w:val="clear"/>
+              <w:top w:val="single" w:color="7F8C93" w:sz="4"/>
+              <w:left w:val="single" w:color="7F8C93" w:sz="4"/>
+              <w:bottom w:val="single" w:color="7F8C93" w:sz="4"/>
+              <w:right w:val="single" w:color="7F8C93" w:sz="4"/>
+            </w:tcBorders>
+            <w:shd w:fill="0B4A8F" w:color="auto" w:val="clear"/>
             <w:tcMar>
               <w:top w:type="dxa" w:w="80"/>
               <w:left w:type="dxa" w:w="120"/>
@@ -592,7 +599,7 @@
               <w:rPr>
                 <w:b/>
                 <w:bCs/>
-                <w:color w:val="1F6F8B"/>
+                <w:color w:val="FFFFFF"/>
               </w:rPr>
               <w:t xml:space="preserve">去哪看</w:t>
             </w:r>
@@ -602,12 +609,12 @@
           <w:tcPr>
             <w:tcW w:type="dxa" w:w="4000"/>
             <w:tcBorders>
-              <w:top w:val="single" w:color="C9D3D7" w:sz="4"/>
-              <w:left w:val="single" w:color="C9D3D7" w:sz="4"/>
-              <w:bottom w:val="single" w:color="C9D3D7" w:sz="4"/>
-              <w:right w:val="single" w:color="C9D3D7" w:sz="4"/>
-            </w:tcBorders>
-            <w:shd w:fill="E2EFF4" w:color="auto" w:val="clear"/>
+              <w:top w:val="single" w:color="7F8C93" w:sz="4"/>
+              <w:left w:val="single" w:color="7F8C93" w:sz="4"/>
+              <w:bottom w:val="single" w:color="7F8C93" w:sz="4"/>
+              <w:right w:val="single" w:color="7F8C93" w:sz="4"/>
+            </w:tcBorders>
+            <w:shd w:fill="0B4A8F" w:color="auto" w:val="clear"/>
             <w:tcMar>
               <w:top w:type="dxa" w:w="80"/>
               <w:left w:type="dxa" w:w="120"/>
@@ -620,7 +627,7 @@
               <w:rPr>
                 <w:b/>
                 <w:bCs/>
-                <w:color w:val="1F6F8B"/>
+                <w:color w:val="FFFFFF"/>
               </w:rPr>
               <w:t xml:space="preserve">怎么处理</w:t>
             </w:r>
@@ -635,10 +642,10 @@
           <w:tcPr>
             <w:tcW w:type="dxa" w:w="2500"/>
             <w:tcBorders>
-              <w:top w:val="single" w:color="C9D3D7" w:sz="4"/>
-              <w:left w:val="single" w:color="C9D3D7" w:sz="4"/>
-              <w:bottom w:val="single" w:color="C9D3D7" w:sz="4"/>
-              <w:right w:val="single" w:color="C9D3D7" w:sz="4"/>
+              <w:top w:val="single" w:color="7F8C93" w:sz="4"/>
+              <w:left w:val="single" w:color="7F8C93" w:sz="4"/>
+              <w:bottom w:val="single" w:color="7F8C93" w:sz="4"/>
+              <w:right w:val="single" w:color="7F8C93" w:sz="4"/>
             </w:tcBorders>
             <w:tcMar>
               <w:top w:type="dxa" w:w="80"/>
@@ -664,10 +671,10 @@
           <w:tcPr>
             <w:tcW w:type="dxa" w:w="2000"/>
             <w:tcBorders>
-              <w:top w:val="single" w:color="C9D3D7" w:sz="4"/>
-              <w:left w:val="single" w:color="C9D3D7" w:sz="4"/>
-              <w:bottom w:val="single" w:color="C9D3D7" w:sz="4"/>
-              <w:right w:val="single" w:color="C9D3D7" w:sz="4"/>
+              <w:top w:val="single" w:color="7F8C93" w:sz="4"/>
+              <w:left w:val="single" w:color="7F8C93" w:sz="4"/>
+              <w:bottom w:val="single" w:color="7F8C93" w:sz="4"/>
+              <w:right w:val="single" w:color="7F8C93" w:sz="4"/>
             </w:tcBorders>
             <w:tcMar>
               <w:top w:type="dxa" w:w="80"/>
@@ -686,10 +693,10 @@
           <w:tcPr>
             <w:tcW w:type="dxa" w:w="4460"/>
             <w:tcBorders>
-              <w:top w:val="single" w:color="C9D3D7" w:sz="4"/>
-              <w:left w:val="single" w:color="C9D3D7" w:sz="4"/>
-              <w:bottom w:val="single" w:color="C9D3D7" w:sz="4"/>
-              <w:right w:val="single" w:color="C9D3D7" w:sz="4"/>
+              <w:top w:val="single" w:color="7F8C93" w:sz="4"/>
+              <w:left w:val="single" w:color="7F8C93" w:sz="4"/>
+              <w:bottom w:val="single" w:color="7F8C93" w:sz="4"/>
+              <w:right w:val="single" w:color="7F8C93" w:sz="4"/>
             </w:tcBorders>
             <w:tcMar>
               <w:top w:type="dxa" w:w="80"/>
@@ -702,7 +709,8 @@
             <w:r>
               <w:rPr>
                 <w:rFonts w:ascii="Consolas" w:cs="Consolas" w:eastAsia="Microsoft YaHei" w:hAnsi="Consolas"/>
-                <w:shd w:fill="E2EFF4" w:color="auto" w:val="clear"/>
+                <w:color w:val="000000"/>
+                <w:shd w:fill="EDEDED" w:color="auto" w:val="clear"/>
               </w:rPr>
               <w:t xml:space="preserve">netstat -ano | findstr :8001</w:t>
             </w:r>
@@ -712,7 +720,8 @@
             <w:r>
               <w:rPr>
                 <w:rFonts w:ascii="Consolas" w:cs="Consolas" w:eastAsia="Microsoft YaHei" w:hAnsi="Consolas"/>
-                <w:shd w:fill="E2EFF4" w:color="auto" w:val="clear"/>
+                <w:color w:val="000000"/>
+                <w:shd w:fill="EDEDED" w:color="auto" w:val="clear"/>
               </w:rPr>
               <w:t xml:space="preserve">logs\ora_appy.log</w:t>
             </w:r>
@@ -725,10 +734,10 @@
           <w:tcPr>
             <w:tcW w:type="dxa" w:w="4000"/>
             <w:tcBorders>
-              <w:top w:val="single" w:color="C9D3D7" w:sz="4"/>
-              <w:left w:val="single" w:color="C9D3D7" w:sz="4"/>
-              <w:bottom w:val="single" w:color="C9D3D7" w:sz="4"/>
-              <w:right w:val="single" w:color="C9D3D7" w:sz="4"/>
+              <w:top w:val="single" w:color="7F8C93" w:sz="4"/>
+              <w:left w:val="single" w:color="7F8C93" w:sz="4"/>
+              <w:bottom w:val="single" w:color="7F8C93" w:sz="4"/>
+              <w:right w:val="single" w:color="7F8C93" w:sz="4"/>
             </w:tcBorders>
             <w:tcMar>
               <w:top w:type="dxa" w:w="80"/>
@@ -744,7 +753,8 @@
             <w:r>
               <w:rPr>
                 <w:rFonts w:ascii="Consolas" w:cs="Consolas" w:eastAsia="Microsoft YaHei" w:hAnsi="Consolas"/>
-                <w:shd w:fill="E2EFF4" w:color="auto" w:val="clear"/>
+                <w:color w:val="000000"/>
+                <w:shd w:fill="EDEDED" w:color="auto" w:val="clear"/>
               </w:rPr>
               <w:t xml:space="preserve">Start-Service</w:t>
             </w:r>
@@ -759,10 +769,10 @@
           <w:tcPr>
             <w:tcW w:type="dxa" w:w="2500"/>
             <w:tcBorders>
-              <w:top w:val="single" w:color="C9D3D7" w:sz="4"/>
-              <w:left w:val="single" w:color="C9D3D7" w:sz="4"/>
-              <w:bottom w:val="single" w:color="C9D3D7" w:sz="4"/>
-              <w:right w:val="single" w:color="C9D3D7" w:sz="4"/>
+              <w:top w:val="single" w:color="7F8C93" w:sz="4"/>
+              <w:left w:val="single" w:color="7F8C93" w:sz="4"/>
+              <w:bottom w:val="single" w:color="7F8C93" w:sz="4"/>
+              <w:right w:val="single" w:color="7F8C93" w:sz="4"/>
             </w:tcBorders>
             <w:tcMar>
               <w:top w:type="dxa" w:w="80"/>
@@ -788,10 +798,10 @@
           <w:tcPr>
             <w:tcW w:type="dxa" w:w="2000"/>
             <w:tcBorders>
-              <w:top w:val="single" w:color="C9D3D7" w:sz="4"/>
-              <w:left w:val="single" w:color="C9D3D7" w:sz="4"/>
-              <w:bottom w:val="single" w:color="C9D3D7" w:sz="4"/>
-              <w:right w:val="single" w:color="C9D3D7" w:sz="4"/>
+              <w:top w:val="single" w:color="7F8C93" w:sz="4"/>
+              <w:left w:val="single" w:color="7F8C93" w:sz="4"/>
+              <w:bottom w:val="single" w:color="7F8C93" w:sz="4"/>
+              <w:right w:val="single" w:color="7F8C93" w:sz="4"/>
             </w:tcBorders>
             <w:tcMar>
               <w:top w:type="dxa" w:w="80"/>
@@ -810,10 +820,10 @@
           <w:tcPr>
             <w:tcW w:type="dxa" w:w="4460"/>
             <w:tcBorders>
-              <w:top w:val="single" w:color="C9D3D7" w:sz="4"/>
-              <w:left w:val="single" w:color="C9D3D7" w:sz="4"/>
-              <w:bottom w:val="single" w:color="C9D3D7" w:sz="4"/>
-              <w:right w:val="single" w:color="C9D3D7" w:sz="4"/>
+              <w:top w:val="single" w:color="7F8C93" w:sz="4"/>
+              <w:left w:val="single" w:color="7F8C93" w:sz="4"/>
+              <w:bottom w:val="single" w:color="7F8C93" w:sz="4"/>
+              <w:right w:val="single" w:color="7F8C93" w:sz="4"/>
             </w:tcBorders>
             <w:tcMar>
               <w:top w:type="dxa" w:w="80"/>
@@ -826,7 +836,8 @@
             <w:r>
               <w:rPr>
                 <w:rFonts w:ascii="Consolas" w:cs="Consolas" w:eastAsia="Microsoft YaHei" w:hAnsi="Consolas"/>
-                <w:shd w:fill="E2EFF4" w:color="auto" w:val="clear"/>
+                <w:color w:val="000000"/>
+                <w:shd w:fill="EDEDED" w:color="auto" w:val="clear"/>
               </w:rPr>
               <w:t xml:space="preserve">ora_appy.log</w:t>
             </w:r>
@@ -839,10 +850,10 @@
           <w:tcPr>
             <w:tcW w:type="dxa" w:w="4000"/>
             <w:tcBorders>
-              <w:top w:val="single" w:color="C9D3D7" w:sz="4"/>
-              <w:left w:val="single" w:color="C9D3D7" w:sz="4"/>
-              <w:bottom w:val="single" w:color="C9D3D7" w:sz="4"/>
-              <w:right w:val="single" w:color="C9D3D7" w:sz="4"/>
+              <w:top w:val="single" w:color="7F8C93" w:sz="4"/>
+              <w:left w:val="single" w:color="7F8C93" w:sz="4"/>
+              <w:bottom w:val="single" w:color="7F8C93" w:sz="4"/>
+              <w:right w:val="single" w:color="7F8C93" w:sz="4"/>
             </w:tcBorders>
             <w:tcMar>
               <w:top w:type="dxa" w:w="80"/>
@@ -866,10 +877,10 @@
           <w:tcPr>
             <w:tcW w:type="dxa" w:w="2500"/>
             <w:tcBorders>
-              <w:top w:val="single" w:color="C9D3D7" w:sz="4"/>
-              <w:left w:val="single" w:color="C9D3D7" w:sz="4"/>
-              <w:bottom w:val="single" w:color="C9D3D7" w:sz="4"/>
-              <w:right w:val="single" w:color="C9D3D7" w:sz="4"/>
+              <w:top w:val="single" w:color="7F8C93" w:sz="4"/>
+              <w:left w:val="single" w:color="7F8C93" w:sz="4"/>
+              <w:bottom w:val="single" w:color="7F8C93" w:sz="4"/>
+              <w:right w:val="single" w:color="7F8C93" w:sz="4"/>
             </w:tcBorders>
             <w:tcMar>
               <w:top w:type="dxa" w:w="80"/>
@@ -895,10 +906,10 @@
           <w:tcPr>
             <w:tcW w:type="dxa" w:w="2000"/>
             <w:tcBorders>
-              <w:top w:val="single" w:color="C9D3D7" w:sz="4"/>
-              <w:left w:val="single" w:color="C9D3D7" w:sz="4"/>
-              <w:bottom w:val="single" w:color="C9D3D7" w:sz="4"/>
-              <w:right w:val="single" w:color="C9D3D7" w:sz="4"/>
+              <w:top w:val="single" w:color="7F8C93" w:sz="4"/>
+              <w:left w:val="single" w:color="7F8C93" w:sz="4"/>
+              <w:bottom w:val="single" w:color="7F8C93" w:sz="4"/>
+              <w:right w:val="single" w:color="7F8C93" w:sz="4"/>
             </w:tcBorders>
             <w:tcMar>
               <w:top w:type="dxa" w:w="80"/>
@@ -917,10 +928,10 @@
           <w:tcPr>
             <w:tcW w:type="dxa" w:w="4460"/>
             <w:tcBorders>
-              <w:top w:val="single" w:color="C9D3D7" w:sz="4"/>
-              <w:left w:val="single" w:color="C9D3D7" w:sz="4"/>
-              <w:bottom w:val="single" w:color="C9D3D7" w:sz="4"/>
-              <w:right w:val="single" w:color="C9D3D7" w:sz="4"/>
+              <w:top w:val="single" w:color="7F8C93" w:sz="4"/>
+              <w:left w:val="single" w:color="7F8C93" w:sz="4"/>
+              <w:bottom w:val="single" w:color="7F8C93" w:sz="4"/>
+              <w:right w:val="single" w:color="7F8C93" w:sz="4"/>
             </w:tcBorders>
             <w:tcMar>
               <w:top w:type="dxa" w:w="80"/>
@@ -933,7 +944,8 @@
             <w:r>
               <w:rPr>
                 <w:rFonts w:ascii="Consolas" w:cs="Consolas" w:eastAsia="Microsoft YaHei" w:hAnsi="Consolas"/>
-                <w:shd w:fill="E2EFF4" w:color="auto" w:val="clear"/>
+                <w:color w:val="000000"/>
+                <w:shd w:fill="EDEDED" w:color="auto" w:val="clear"/>
               </w:rPr>
               <w:t xml:space="preserve">ora_appy.log</w:t>
             </w:r>
@@ -946,10 +958,10 @@
           <w:tcPr>
             <w:tcW w:type="dxa" w:w="4000"/>
             <w:tcBorders>
-              <w:top w:val="single" w:color="C9D3D7" w:sz="4"/>
-              <w:left w:val="single" w:color="C9D3D7" w:sz="4"/>
-              <w:bottom w:val="single" w:color="C9D3D7" w:sz="4"/>
-              <w:right w:val="single" w:color="C9D3D7" w:sz="4"/>
+              <w:top w:val="single" w:color="7F8C93" w:sz="4"/>
+              <w:left w:val="single" w:color="7F8C93" w:sz="4"/>
+              <w:bottom w:val="single" w:color="7F8C93" w:sz="4"/>
+              <w:right w:val="single" w:color="7F8C93" w:sz="4"/>
             </w:tcBorders>
             <w:tcMar>
               <w:top w:type="dxa" w:w="80"/>
@@ -973,10 +985,10 @@
           <w:tcPr>
             <w:tcW w:type="dxa" w:w="2500"/>
             <w:tcBorders>
-              <w:top w:val="single" w:color="C9D3D7" w:sz="4"/>
-              <w:left w:val="single" w:color="C9D3D7" w:sz="4"/>
-              <w:bottom w:val="single" w:color="C9D3D7" w:sz="4"/>
-              <w:right w:val="single" w:color="C9D3D7" w:sz="4"/>
+              <w:top w:val="single" w:color="7F8C93" w:sz="4"/>
+              <w:left w:val="single" w:color="7F8C93" w:sz="4"/>
+              <w:bottom w:val="single" w:color="7F8C93" w:sz="4"/>
+              <w:right w:val="single" w:color="7F8C93" w:sz="4"/>
             </w:tcBorders>
             <w:tcMar>
               <w:top w:type="dxa" w:w="80"/>
@@ -995,10 +1007,10 @@
           <w:tcPr>
             <w:tcW w:type="dxa" w:w="2000"/>
             <w:tcBorders>
-              <w:top w:val="single" w:color="C9D3D7" w:sz="4"/>
-              <w:left w:val="single" w:color="C9D3D7" w:sz="4"/>
-              <w:bottom w:val="single" w:color="C9D3D7" w:sz="4"/>
-              <w:right w:val="single" w:color="C9D3D7" w:sz="4"/>
+              <w:top w:val="single" w:color="7F8C93" w:sz="4"/>
+              <w:left w:val="single" w:color="7F8C93" w:sz="4"/>
+              <w:bottom w:val="single" w:color="7F8C93" w:sz="4"/>
+              <w:right w:val="single" w:color="7F8C93" w:sz="4"/>
             </w:tcBorders>
             <w:tcMar>
               <w:top w:type="dxa" w:w="80"/>
@@ -1017,10 +1029,10 @@
           <w:tcPr>
             <w:tcW w:type="dxa" w:w="4460"/>
             <w:tcBorders>
-              <w:top w:val="single" w:color="C9D3D7" w:sz="4"/>
-              <w:left w:val="single" w:color="C9D3D7" w:sz="4"/>
-              <w:bottom w:val="single" w:color="C9D3D7" w:sz="4"/>
-              <w:right w:val="single" w:color="C9D3D7" w:sz="4"/>
+              <w:top w:val="single" w:color="7F8C93" w:sz="4"/>
+              <w:left w:val="single" w:color="7F8C93" w:sz="4"/>
+              <w:bottom w:val="single" w:color="7F8C93" w:sz="4"/>
+              <w:right w:val="single" w:color="7F8C93" w:sz="4"/>
             </w:tcBorders>
             <w:tcMar>
               <w:top w:type="dxa" w:w="80"/>
@@ -1039,10 +1051,10 @@
           <w:tcPr>
             <w:tcW w:type="dxa" w:w="4000"/>
             <w:tcBorders>
-              <w:top w:val="single" w:color="C9D3D7" w:sz="4"/>
-              <w:left w:val="single" w:color="C9D3D7" w:sz="4"/>
-              <w:bottom w:val="single" w:color="C9D3D7" w:sz="4"/>
-              <w:right w:val="single" w:color="C9D3D7" w:sz="4"/>
+              <w:top w:val="single" w:color="7F8C93" w:sz="4"/>
+              <w:left w:val="single" w:color="7F8C93" w:sz="4"/>
+              <w:bottom w:val="single" w:color="7F8C93" w:sz="4"/>
+              <w:right w:val="single" w:color="7F8C93" w:sz="4"/>
             </w:tcBorders>
             <w:tcMar>
               <w:top w:type="dxa" w:w="80"/>
@@ -1084,7 +1096,7 @@
     </w:p>
     <w:p>
       <w:pPr>
-        <w:shd w:fill="F1F3F4" w:color="auto" w:val="clear"/>
+        <w:shd w:fill="EDEDED" w:color="auto" w:val="clear"/>
         <w:spacing w:after="0"/>
         <w:ind w:left="160"/>
       </w:pPr>
@@ -1119,7 +1131,7 @@
     </w:p>
     <w:p>
       <w:pPr>
-        <w:shd w:fill="F1F3F4" w:color="auto" w:val="clear"/>
+        <w:shd w:fill="EDEDED" w:color="auto" w:val="clear"/>
         <w:spacing w:after="0"/>
         <w:ind w:left="160"/>
       </w:pPr>
@@ -1134,7 +1146,7 @@
     </w:p>
     <w:p>
       <w:pPr>
-        <w:shd w:fill="F1F3F4" w:color="auto" w:val="clear"/>
+        <w:shd w:fill="EDEDED" w:color="auto" w:val="clear"/>
         <w:spacing w:after="0"/>
         <w:ind w:left="160"/>
       </w:pPr>
@@ -1169,7 +1181,8 @@
       <w:r>
         <w:rPr>
           <w:rFonts w:ascii="Consolas" w:cs="Consolas" w:eastAsia="Microsoft YaHei" w:hAnsi="Consolas"/>
-          <w:shd w:fill="E2EFF4" w:color="auto" w:val="clear"/>
+          <w:color w:val="000000"/>
+          <w:shd w:fill="EDEDED" w:color="auto" w:val="clear"/>
         </w:rPr>
         <w:t xml:space="preserve">Restart-Service</w:t>
       </w:r>
@@ -1179,7 +1192,7 @@
     </w:p>
     <w:p>
       <w:pPr>
-        <w:shd w:fill="F1F3F4" w:color="auto" w:val="clear"/>
+        <w:shd w:fill="EDEDED" w:color="auto" w:val="clear"/>
         <w:spacing w:after="0"/>
         <w:ind w:left="160"/>
       </w:pPr>
@@ -1194,7 +1207,7 @@
     </w:p>
     <w:p>
       <w:pPr>
-        <w:shd w:fill="F1F3F4" w:color="auto" w:val="clear"/>
+        <w:shd w:fill="EDEDED" w:color="auto" w:val="clear"/>
         <w:spacing w:after="0"/>
         <w:ind w:left="160"/>
       </w:pPr>
@@ -1209,7 +1222,7 @@
     </w:p>
     <w:p>
       <w:pPr>
-        <w:shd w:fill="F1F3F4" w:color="auto" w:val="clear"/>
+        <w:shd w:fill="EDEDED" w:color="auto" w:val="clear"/>
         <w:spacing w:after="0"/>
         <w:ind w:left="160"/>
       </w:pPr>
@@ -1244,7 +1257,7 @@
     </w:p>
     <w:p>
       <w:pPr>
-        <w:shd w:fill="F1F3F4" w:color="auto" w:val="clear"/>
+        <w:shd w:fill="EDEDED" w:color="auto" w:val="clear"/>
         <w:spacing w:after="0"/>
         <w:ind w:left="160"/>
       </w:pPr>
@@ -1687,7 +1700,7 @@
       <w:rFonts w:ascii="Calibri" w:cs="Calibri" w:eastAsia="Microsoft YaHei" w:hAnsi="Calibri"/>
       <w:b/>
       <w:bCs/>
-      <w:color w:val="1F6F8B"/>
+      <w:color w:val="0B4A8F"/>
       <w:sz w:val="30"/>
       <w:szCs w:val="30"/>
     </w:rPr>

</xml_diff>